<commit_message>
v3.0: add completed kmacs k=3 E. coli/Shigella result to Table 12
kmacs k=3 distance matrix for 27 x ~4.6 Mb genomes completed after 9.25 h
single-threaded (vs 10 s Mash, ~4 min k-mer cosine k-scan). ETE3 nRF =
0.542 -- worse than the k-mer cosine plateau (0.500) and far worse than
Mash (0.208). Table 12 cell updated (n/a -> 0.542), footnote 3 rewritten
with actual runtime, Finding 3 notes kmacs also fails at strain level.
Mash k21 NJ rebuild cross-validated (0.2083, identical to archived tree).
All fish Table 12 values re-verified against ETE3 scorer (5/5 OK).
</commit_message>
<xml_diff>
--- a/NAR_MANUSCRIPT_REVISED_v3.0.docx
+++ b/NAR_MANUSCRIPT_REVISED_v3.0.docx
@@ -7273,7 +7273,7 @@
               <w:jc w:val="center"/>
             </w:pPr>
             <w:r>
-              <w:t xml:space="preserve">n/a ³</w:t>
+              <w:t xml:space="preserve">0.542 ³</w:t>
             </w:r>
           </w:p>
         </w:tc>
@@ -7529,7 +7529,7 @@
         <w:t xml:space="preserve"> </w:t>
       </w:r>
       <w:r>
-        <w:t xml:space="preserve">³ kmacs (single-threaded) did not complete on the 27 × ~4.6 Mb dataset within our single-workstation compute budget (&gt;40 min without producing a distance matrix); Mash and the published AFproject leaderboard provide the genome-scale comparators for this dataset.</w:t>
+        <w:t xml:space="preserve">³ kmacs (single-threaded) required 9.25 hours to compute the distance matrix for the 27 × ~4.6 Mb dataset — versus 10 s for Mash and ~4 min for the full k-mer cosine k-scan — and the resulting tree (nRF=0.542) does not beat the k-mer cosine plateau (0.500) on this dataset. Mash and the published AFproject leaderboard remain the stronger genome-scale comparators here.</w:t>
       </w:r>
     </w:p>
     <w:p>
@@ -7600,7 +7600,7 @@
         <w:t xml:space="preserve"> </w:t>
       </w:r>
       <w:r>
-        <w:t xml:space="preserve">On the 27-genome dataset (within-species divergence, recombination and gene gain/loss dominate over substitution), k-mer cosine plateaus at nRF=0.50 for all k≥9 and all multi-k variants, whereas Mash reaches 0.208 (our run) / 0.12 (published), and anchor-based methods reach 0.08 (published andi, Co-phylog, phylonium). At within-species identity, the frequency-vector difference between genomes is dominated by the conserved background, while anchor- and sketch-based distances (shared k-mer fractions, average common substrings) remain sensitive to the small divergent fraction. We conclude that k-mer cosine distances are the method of choice for moderate-to-deep divergence (gene families across genera to phyla, organelle genomes, the simulated 5%-substitution regime), and recommend anchor-based or MinHash methods for strain-level bacterial collections — a boundary that complements the 16S structured-gene boundary reported above.</w:t>
+        <w:t xml:space="preserve">On the 27-genome dataset (within-species divergence, recombination and gene gain/loss dominate over substitution), k-mer cosine plateaus at nRF=0.50 for all k≥9 and all multi-k variants, and kmacs (k=3; 9.25 h runtime) performs no better (nRF=0.542), whereas Mash reaches 0.208 (our run) / 0.12 (published), and anchor-based methods reach 0.08 (published andi, Co-phylog, phylonium). At within-species identity, the frequency-vector difference between genomes is dominated by the conserved background, while anchor- and sketch-based distances (shared k-mer fractions, average common substrings) remain sensitive to the small divergent fraction — note that kmacs, despite being substring-based, also fails to exploit this fraction at its gene-scale k=3 configuration. We conclude that k-mer cosine distances are the method of choice for moderate-to-deep divergence (gene families across genera to phyla, organelle genomes, the simulated 5%-substitution regime), and recommend anchor-based or MinHash methods for strain-level bacterial collections — a boundary that complements the 16S structured-gene boundary reported above.</w:t>
       </w:r>
     </w:p>
     <w:bookmarkEnd w:id="46"/>

</xml_diff>